<commit_message>
docs: Update gameplay screenshot with more detailed view
</commit_message>
<xml_diff>
--- a/pertemuan 17/dokumentasi.docx
+++ b/pertemuan 17/dokumentasi.docx
@@ -538,12 +538,12 @@
           <wp:inline>
             <wp:extent cx="5334000" cy="4943567"/>
             <wp:effectExtent b="0" l="0" r="0" t="0"/>
-            <wp:docPr descr="Gameplay Berlangsung" title="" id="27" name="Picture"/>
+            <wp:docPr descr="Gameplay Berlangsung Terdetail" title="" id="27" name="Picture"/>
             <a:graphic>
               <a:graphicData uri="http://schemas.openxmlformats.org/drawingml/2006/picture">
                 <pic:pic>
                   <pic:nvPicPr>
-                    <pic:cNvPr descr="screenshots/p17_game.png" id="28" name="Picture"/>
+                    <pic:cNvPr descr="screenshots/p17_gameplay_detail.png" id="28" name="Picture"/>
                     <pic:cNvPicPr>
                       <a:picLocks noChangeArrowheads="1" noChangeAspect="1"/>
                     </pic:cNvPicPr>

</xml_diff>